<commit_message>
Final? revisons on N+NFLPoints worksheet and solutions
</commit_message>
<xml_diff>
--- a/RLock/NFLPoints/Module/NFLPointsSolutions1.docx
+++ b/RLock/NFLPoints/Module/NFLPointsSolutions1.docx
@@ -587,6 +587,13 @@
           <w:color w:val="EE0000"/>
         </w:rPr>
         <w:t>CI for a mean</w:t>
+      </w:r>
+      <w:r>
+        <w:rPr>
+          <w:rFonts w:ascii="Times New Roman" w:hAnsi="Times New Roman" w:cs="Times New Roman"/>
+          <w:color w:val="EE0000"/>
+        </w:rPr>
+        <w:t xml:space="preserve"> (one sample)</w:t>
       </w:r>
     </w:p>
     <w:p>

</xml_diff>